<commit_message>
Add Suggested Talking Points section to the ministerial brief format
New section (rule 9) gives the Minister 3-4 data-grounded, neutral talking
points for the meeting. Updates the Word doc KB, the text standards, the lab
guide rule list, and the worked example.
</commit_message>
<xml_diff>
--- a/1. Orchestrate/Ministerial Brief Agent/Ministerial Brief Format.docx
+++ b/1. Orchestrate/Ministerial Brief Agent/Ministerial Brief Format.docx
@@ -120,6 +120,19 @@
       </w:pPr>
       <w:r>
         <w:t xml:space="preserve">FINANCIAL IMPLICATIONS — always include this section; state “No direct financial implications” if there are none.</w:t>
+      </w:r>
+    </w:p>
+    <w:p>
+      <w:pPr>
+        <w:pStyle w:val="ListParagraph"/>
+        <w:numPr>
+          <w:ilvl w:val="0"/>
+          <w:numId w:val="2"/>
+        </w:numPr>
+        <w:spacing w:after="40"/>
+      </w:pPr>
+      <w:r>
+        <w:t xml:space="preserve">SUGGESTED TALKING POINTS — 3 to 4 short, data-grounded, politically neutral points the Minister can use in the meeting.</w:t>
       </w:r>
     </w:p>
     <w:p>
@@ -641,6 +654,58 @@
           </w:p>
         </w:tc>
       </w:tr>
+      <w:tr>
+        <w:tc>
+          <w:tcPr>
+            <w:tcW w:type="dxa" w:w="1500"/>
+            <w:tcBorders>
+              <w:top w:val="single" w:color="CCCCCC" w:sz="1"/>
+              <w:left w:val="single" w:color="CCCCCC" w:sz="1"/>
+              <w:bottom w:val="single" w:color="CCCCCC" w:sz="1"/>
+              <w:right w:val="single" w:color="CCCCCC" w:sz="1"/>
+            </w:tcBorders>
+            <w:shd w:fill="EAF1F8" w:val="clear"/>
+            <w:tcMar>
+              <w:top w:type="dxa" w:w="80"/>
+              <w:left w:type="dxa" w:w="120"/>
+              <w:bottom w:type="dxa" w:w="80"/>
+              <w:right w:type="dxa" w:w="120"/>
+            </w:tcMar>
+          </w:tcPr>
+          <w:p>
+            <w:r>
+              <w:rPr>
+                <w:b/>
+                <w:bCs/>
+              </w:rPr>
+              <w:t xml:space="preserve">9</w:t>
+            </w:r>
+          </w:p>
+        </w:tc>
+        <w:tc>
+          <w:tcPr>
+            <w:tcW w:type="dxa" w:w="7860"/>
+            <w:tcBorders>
+              <w:top w:val="single" w:color="CCCCCC" w:sz="1"/>
+              <w:left w:val="single" w:color="CCCCCC" w:sz="1"/>
+              <w:bottom w:val="single" w:color="CCCCCC" w:sz="1"/>
+              <w:right w:val="single" w:color="CCCCCC" w:sz="1"/>
+            </w:tcBorders>
+            <w:shd w:fill="EAF1F8" w:val="clear"/>
+            <w:tcMar>
+              <w:top w:type="dxa" w:w="80"/>
+              <w:left w:type="dxa" w:w="120"/>
+              <w:bottom w:type="dxa" w:w="80"/>
+              <w:right w:type="dxa" w:w="120"/>
+            </w:tcMar>
+          </w:tcPr>
+          <w:p>
+            <w:r>
+              <w:t xml:space="preserve">A SUGGESTED TALKING POINTS section offers 3–4 short, data-grounded, politically neutral points the Minister can use in the meeting.</w:t>
+            </w:r>
+          </w:p>
+        </w:tc>
+      </w:tr>
     </w:tbl>
     <w:p>
       <w:pPr>
@@ -710,7 +775,7 @@
         <w:pStyle w:val="ListParagraph"/>
         <w:numPr>
           <w:ilvl w:val="0"/>
-          <w:numId w:val="2"/>
+          <w:numId w:val="3"/>
         </w:numPr>
         <w:spacing w:after="20"/>
       </w:pPr>
@@ -723,7 +788,7 @@
         <w:pStyle w:val="ListParagraph"/>
         <w:numPr>
           <w:ilvl w:val="0"/>
-          <w:numId w:val="2"/>
+          <w:numId w:val="3"/>
         </w:numPr>
         <w:spacing w:after="20"/>
       </w:pPr>
@@ -736,7 +801,7 @@
         <w:pStyle w:val="ListParagraph"/>
         <w:numPr>
           <w:ilvl w:val="0"/>
-          <w:numId w:val="2"/>
+          <w:numId w:val="3"/>
         </w:numPr>
         <w:spacing w:after="20"/>
       </w:pPr>
@@ -749,7 +814,7 @@
         <w:pStyle w:val="ListParagraph"/>
         <w:numPr>
           <w:ilvl w:val="0"/>
-          <w:numId w:val="2"/>
+          <w:numId w:val="3"/>
         </w:numPr>
         <w:spacing w:after="20"/>
       </w:pPr>
@@ -785,6 +850,57 @@
       </w:r>
       <w:r>
         <w:t xml:space="preserve">No direct financial implications.</w:t>
+      </w:r>
+    </w:p>
+    <w:p>
+      <w:pPr>
+        <w:spacing w:before="80"/>
+      </w:pPr>
+      <w:r>
+        <w:rPr>
+          <w:b/>
+          <w:bCs/>
+        </w:rPr>
+        <w:t xml:space="preserve">SUGGESTED TALKING POINTS:</w:t>
+      </w:r>
+    </w:p>
+    <w:p>
+      <w:pPr>
+        <w:pStyle w:val="ListParagraph"/>
+        <w:numPr>
+          <w:ilvl w:val="0"/>
+          <w:numId w:val="3"/>
+        </w:numPr>
+        <w:spacing w:after="20"/>
+      </w:pPr>
+      <w:r>
+        <w:t xml:space="preserve">The Government recognises healthcare workforce pressures, with 48% of occupations in national shortage (JSA Occupation Shortage List 2025, April 2026).</w:t>
+      </w:r>
+    </w:p>
+    <w:p>
+      <w:pPr>
+        <w:pStyle w:val="ListParagraph"/>
+        <w:numPr>
+          <w:ilvl w:val="0"/>
+          <w:numId w:val="3"/>
+        </w:numPr>
+        <w:spacing w:after="20"/>
+      </w:pPr>
+      <w:r>
+        <w:t xml:space="preserve">Retention — not only training — is central; it is the primary driver of these shortages.</w:t>
+      </w:r>
+    </w:p>
+    <w:p>
+      <w:pPr>
+        <w:pStyle w:val="ListParagraph"/>
+        <w:numPr>
+          <w:ilvl w:val="0"/>
+          <w:numId w:val="3"/>
+        </w:numPr>
+        <w:spacing w:after="20"/>
+      </w:pPr>
+      <w:r>
+        <w:t xml:space="preserve">Regional access is a particular focus, with regional fill rates (62.9%) below metro (69.7%).</w:t>
       </w:r>
     </w:p>
     <w:p>
@@ -1003,6 +1119,18 @@
       </w:pPr>
     </w:lvl>
   </w:abstractNum>
+  <w:abstractNum w:abstractNumId="3" w15:restartNumberingAfterBreak="0">
+    <w:multiLevelType w:val="hybridMultilevel"/>
+    <w:lvl w:ilvl="0" w15:tentative="1">
+      <w:start w:val="1"/>
+      <w:numFmt w:val="bullet"/>
+      <w:lvlText w:val="•"/>
+      <w:lvlJc w:val="left"/>
+      <w:pPr>
+        <w:ind w:left="720" w:hanging="360"/>
+      </w:pPr>
+    </w:lvl>
+  </w:abstractNum>
   <w:num w:numId="1">
     <w:abstractNumId w:val="1"/>
     <w:lvlOverride w:ilvl="0">
@@ -1011,6 +1139,12 @@
   </w:num>
   <w:num w:numId="2">
     <w:abstractNumId w:val="2"/>
+    <w:lvlOverride w:ilvl="0">
+      <w:startOverride w:val="1"/>
+    </w:lvlOverride>
+  </w:num>
+  <w:num w:numId="3">
+    <w:abstractNumId w:val="3"/>
     <w:lvlOverride w:ilvl="0">
       <w:startOverride w:val="1"/>
     </w:lvlOverride>

</xml_diff>